<commit_message>
Fluxos de autenticação e dados
</commit_message>
<xml_diff>
--- a/docs/Documentacao_Tecnico_Cientifica_ERP_Escolar.docx
+++ b/docs/Documentacao_Tecnico_Cientifica_ERP_Escolar.docx
@@ -338,6 +338,7 @@
     <w:p>
       <w:pPr>
         <w:spacing w:after="300" w:lineRule="auto"/>
+        <w:ind w:firstLine="720"/>
         <w:rPr/>
       </w:pPr>
       <w:r>
@@ -620,6 +621,7 @@
     </w:p>
     <w:p>
       <w:pPr>
+        <w:ind w:firstLine="720"/>
         <w:jc w:val="both"/>
         <w:rPr>
           <w:rFonts w:ascii="Arial" w:cs="Arial" w:eastAsia="Arial" w:hAnsi="Arial"/>
@@ -1139,6 +1141,294 @@
     </w:p>
     <w:p>
       <w:pPr>
+        <w:ind w:firstLine="720"/>
+        <w:jc w:val="both"/>
+        <w:rPr>
+          <w:rFonts w:ascii="Arial" w:cs="Arial" w:eastAsia="Arial" w:hAnsi="Arial"/>
+          <w:sz w:val="24"/>
+          <w:szCs w:val="24"/>
+        </w:rPr>
+      </w:pPr>
+      <w:r>
+        <w:rPr>
+          <w:rFonts w:ascii="Arial" w:cs="Arial" w:eastAsia="Arial" w:hAnsi="Arial"/>
+          <w:sz w:val="24"/>
+          <w:szCs w:val="24"/>
+          <w:rtl w:val="0"/>
+        </w:rPr>
+        <w:t xml:space="preserve">O processo de login é realizado em /accounts/login/, por meio do envio de e-mail e senha em formulário protegido por CSRF. O </w:t>
+      </w:r>
+      <w:r>
+        <w:rPr>
+          <w:rFonts w:ascii="Arial" w:cs="Arial" w:eastAsia="Arial" w:hAnsi="Arial"/>
+          <w:i w:val="1"/>
+          <w:iCs w:val="1"/>
+          <w:sz w:val="24"/>
+          <w:szCs w:val="24"/>
+          <w:rtl w:val="0"/>
+        </w:rPr>
+        <w:t xml:space="preserve">UsuarioBackend </w:t>
+      </w:r>
+      <w:r>
+        <w:rPr>
+          <w:rFonts w:ascii="Arial" w:cs="Arial" w:eastAsia="Arial" w:hAnsi="Arial"/>
+          <w:sz w:val="24"/>
+          <w:szCs w:val="24"/>
+          <w:rtl w:val="0"/>
+        </w:rPr>
+        <w:t xml:space="preserve">localiza o usuário pelo e-mail e, em caso de e-mail inexistente ou senha incorreta, retorna None sem diferenciar os dois cenários, reduzindo o risco de enumeração de contas.</w:t>
+      </w:r>
+    </w:p>
+    <w:p>
+      <w:pPr>
+        <w:jc w:val="both"/>
+        <w:rPr>
+          <w:rFonts w:ascii="Arial" w:cs="Arial" w:eastAsia="Arial" w:hAnsi="Arial"/>
+          <w:sz w:val="24"/>
+          <w:szCs w:val="24"/>
+        </w:rPr>
+      </w:pPr>
+      <w:r>
+        <w:rPr>
+          <w:rtl w:val="0"/>
+        </w:rPr>
+      </w:r>
+    </w:p>
+    <w:p>
+      <w:pPr>
+        <w:ind w:firstLine="720"/>
+        <w:jc w:val="both"/>
+        <w:rPr>
+          <w:rFonts w:ascii="Arial" w:cs="Arial" w:eastAsia="Arial" w:hAnsi="Arial"/>
+          <w:sz w:val="24"/>
+          <w:szCs w:val="24"/>
+        </w:rPr>
+      </w:pPr>
+      <w:r>
+        <w:rPr>
+          <w:rFonts w:ascii="Arial" w:cs="Arial" w:eastAsia="Arial" w:hAnsi="Arial"/>
+          <w:sz w:val="24"/>
+          <w:szCs w:val="24"/>
+          <w:rtl w:val="0"/>
+        </w:rPr>
+        <w:t xml:space="preserve">Antes da validação da senha, é verificado se existe bloqueio ativo decorrente de tentativas consecutivas de autenticação. A cada tentativa inválida, o contador </w:t>
+      </w:r>
+      <w:r>
+        <w:rPr>
+          <w:rFonts w:ascii="Arial" w:cs="Arial" w:eastAsia="Arial" w:hAnsi="Arial"/>
+          <w:i w:val="1"/>
+          <w:iCs w:val="1"/>
+          <w:sz w:val="24"/>
+          <w:szCs w:val="24"/>
+          <w:rtl w:val="0"/>
+        </w:rPr>
+        <w:t xml:space="preserve">tentativas_login_falhas </w:t>
+      </w:r>
+      <w:r>
+        <w:rPr>
+          <w:rFonts w:ascii="Arial" w:cs="Arial" w:eastAsia="Arial" w:hAnsi="Arial"/>
+          <w:sz w:val="24"/>
+          <w:szCs w:val="24"/>
+          <w:rtl w:val="0"/>
+        </w:rPr>
+        <w:t xml:space="preserve">é incrementado e, ao atingir cinco tentativas, a conta é bloqueada por 15 minutos por meio do campo </w:t>
+      </w:r>
+      <w:r>
+        <w:rPr>
+          <w:rFonts w:ascii="Arial" w:cs="Arial" w:eastAsia="Arial" w:hAnsi="Arial"/>
+          <w:i w:val="1"/>
+          <w:iCs w:val="1"/>
+          <w:sz w:val="24"/>
+          <w:szCs w:val="24"/>
+          <w:rtl w:val="0"/>
+        </w:rPr>
+        <w:t xml:space="preserve">bloqueado_ate</w:t>
+      </w:r>
+      <w:r>
+        <w:rPr>
+          <w:rFonts w:ascii="Arial" w:cs="Arial" w:eastAsia="Arial" w:hAnsi="Arial"/>
+          <w:sz w:val="24"/>
+          <w:szCs w:val="24"/>
+          <w:rtl w:val="0"/>
+        </w:rPr>
+        <w:t xml:space="preserve">.</w:t>
+      </w:r>
+    </w:p>
+    <w:p>
+      <w:pPr>
+        <w:jc w:val="both"/>
+        <w:rPr>
+          <w:rFonts w:ascii="Arial" w:cs="Arial" w:eastAsia="Arial" w:hAnsi="Arial"/>
+          <w:sz w:val="24"/>
+          <w:szCs w:val="24"/>
+        </w:rPr>
+      </w:pPr>
+      <w:r>
+        <w:rPr>
+          <w:rtl w:val="0"/>
+        </w:rPr>
+      </w:r>
+    </w:p>
+    <w:p>
+      <w:pPr>
+        <w:ind w:firstLine="720"/>
+        <w:jc w:val="both"/>
+        <w:rPr>
+          <w:rFonts w:ascii="Arial" w:cs="Arial" w:eastAsia="Arial" w:hAnsi="Arial"/>
+          <w:sz w:val="24"/>
+          <w:szCs w:val="24"/>
+        </w:rPr>
+      </w:pPr>
+      <w:r>
+        <w:rPr>
+          <w:rFonts w:ascii="Arial" w:cs="Arial" w:eastAsia="Arial" w:hAnsi="Arial"/>
+          <w:sz w:val="24"/>
+          <w:szCs w:val="24"/>
+          <w:rtl w:val="0"/>
+        </w:rPr>
+        <w:t xml:space="preserve">Após a autenticação primária, o </w:t>
+      </w:r>
+      <w:r>
+        <w:rPr>
+          <w:rFonts w:ascii="Arial" w:cs="Arial" w:eastAsia="Arial" w:hAnsi="Arial"/>
+          <w:i w:val="1"/>
+          <w:iCs w:val="1"/>
+          <w:sz w:val="24"/>
+          <w:szCs w:val="24"/>
+          <w:rtl w:val="0"/>
+        </w:rPr>
+        <w:t xml:space="preserve">Custom2FAAccountAdapter </w:t>
+      </w:r>
+      <w:r>
+        <w:rPr>
+          <w:rFonts w:ascii="Arial" w:cs="Arial" w:eastAsia="Arial" w:hAnsi="Arial"/>
+          <w:sz w:val="24"/>
+          <w:szCs w:val="24"/>
+          <w:rtl w:val="0"/>
+        </w:rPr>
+        <w:t xml:space="preserve">intercepta o fluxo do </w:t>
+      </w:r>
+      <w:r>
+        <w:rPr>
+          <w:rFonts w:ascii="Arial" w:cs="Arial" w:eastAsia="Arial" w:hAnsi="Arial"/>
+          <w:i w:val="1"/>
+          <w:iCs w:val="1"/>
+          <w:sz w:val="24"/>
+          <w:szCs w:val="24"/>
+          <w:rtl w:val="0"/>
+        </w:rPr>
+        <w:t xml:space="preserve">allauth </w:t>
+      </w:r>
+      <w:r>
+        <w:rPr>
+          <w:rFonts w:ascii="Arial" w:cs="Arial" w:eastAsia="Arial" w:hAnsi="Arial"/>
+          <w:sz w:val="24"/>
+          <w:szCs w:val="24"/>
+          <w:rtl w:val="0"/>
+        </w:rPr>
+        <w:t xml:space="preserve">por meio do hook </w:t>
+      </w:r>
+      <w:r>
+        <w:rPr>
+          <w:rFonts w:ascii="Arial" w:cs="Arial" w:eastAsia="Arial" w:hAnsi="Arial"/>
+          <w:i w:val="1"/>
+          <w:iCs w:val="1"/>
+          <w:sz w:val="24"/>
+          <w:szCs w:val="24"/>
+          <w:rtl w:val="0"/>
+        </w:rPr>
+        <w:t xml:space="preserve">pre_login</w:t>
+      </w:r>
+      <w:r>
+        <w:rPr>
+          <w:rFonts w:ascii="Arial" w:cs="Arial" w:eastAsia="Arial" w:hAnsi="Arial"/>
+          <w:sz w:val="24"/>
+          <w:szCs w:val="24"/>
+          <w:rtl w:val="0"/>
+        </w:rPr>
+        <w:t xml:space="preserve">(). Quando o usuário possui 2FA </w:t>
+      </w:r>
+      <w:r>
+        <w:rPr>
+          <w:rFonts w:ascii="Arial" w:cs="Arial" w:eastAsia="Arial" w:hAnsi="Arial"/>
+          <w:sz w:val="24"/>
+          <w:szCs w:val="24"/>
+          <w:rtl w:val="0"/>
+        </w:rPr>
+        <w:t xml:space="preserve">habilitado</w:t>
+      </w:r>
+      <w:r>
+        <w:rPr>
+          <w:rFonts w:ascii="Arial" w:cs="Arial" w:eastAsia="Arial" w:hAnsi="Arial"/>
+          <w:sz w:val="24"/>
+          <w:szCs w:val="24"/>
+          <w:rtl w:val="0"/>
+        </w:rPr>
+        <w:t xml:space="preserve">, a autenticação é direcionada para a validação do token TOTP, e a sessão somente é criada após a confirmação do código por </w:t>
+      </w:r>
+      <w:r>
+        <w:rPr>
+          <w:rFonts w:ascii="Arial" w:cs="Arial" w:eastAsia="Arial" w:hAnsi="Arial"/>
+          <w:i w:val="1"/>
+          <w:iCs w:val="1"/>
+          <w:sz w:val="24"/>
+          <w:szCs w:val="24"/>
+          <w:rtl w:val="0"/>
+        </w:rPr>
+        <w:t xml:space="preserve">verificar_2fa</w:t>
+      </w:r>
+      <w:r>
+        <w:rPr>
+          <w:rFonts w:ascii="Arial" w:cs="Arial" w:eastAsia="Arial" w:hAnsi="Arial"/>
+          <w:sz w:val="24"/>
+          <w:szCs w:val="24"/>
+          <w:rtl w:val="0"/>
+        </w:rPr>
+        <w:t xml:space="preserve">.</w:t>
+      </w:r>
+    </w:p>
+    <w:p>
+      <w:pPr>
+        <w:jc w:val="both"/>
+        <w:rPr>
+          <w:rFonts w:ascii="Arial" w:cs="Arial" w:eastAsia="Arial" w:hAnsi="Arial"/>
+          <w:sz w:val="24"/>
+          <w:szCs w:val="24"/>
+        </w:rPr>
+      </w:pPr>
+      <w:r>
+        <w:rPr>
+          <w:rtl w:val="0"/>
+        </w:rPr>
+      </w:r>
+    </w:p>
+    <w:p>
+      <w:pPr>
+        <w:ind w:firstLine="720"/>
+        <w:jc w:val="both"/>
+        <w:rPr>
+          <w:rFonts w:ascii="Arial" w:cs="Arial" w:eastAsia="Arial" w:hAnsi="Arial"/>
+          <w:sz w:val="28"/>
+          <w:szCs w:val="28"/>
+        </w:rPr>
+      </w:pPr>
+      <w:r>
+        <w:rPr>
+          <w:rFonts w:ascii="Arial" w:cs="Arial" w:eastAsia="Arial" w:hAnsi="Arial"/>
+          <w:sz w:val="24"/>
+          <w:szCs w:val="24"/>
+          <w:rtl w:val="0"/>
+        </w:rPr>
+        <w:t xml:space="preserve">As sessões expiram após 30 minutos de inatividade. O logout é realizado por requisição POST protegida por CSRF, registra o evento no log de auditoria e, em seguida, invalida a sessão no servidor.</w:t>
+      </w:r>
+      <w:r>
+        <w:rPr>
+          <w:rtl w:val="0"/>
+        </w:rPr>
+      </w:r>
+    </w:p>
+    <w:p>
+      <w:pPr>
         <w:pStyle w:val="Heading2"/>
         <w:spacing w:after="100" w:lineRule="auto"/>
         <w:rPr/>
@@ -1152,6 +1442,236 @@
     </w:p>
     <w:p>
       <w:pPr>
+        <w:ind w:firstLine="720"/>
+        <w:jc w:val="both"/>
+        <w:rPr>
+          <w:rFonts w:ascii="Arial" w:cs="Arial" w:eastAsia="Arial" w:hAnsi="Arial"/>
+          <w:sz w:val="24"/>
+          <w:szCs w:val="24"/>
+        </w:rPr>
+      </w:pPr>
+      <w:r>
+        <w:rPr>
+          <w:rFonts w:ascii="Arial" w:cs="Arial" w:eastAsia="Arial" w:hAnsi="Arial"/>
+          <w:sz w:val="24"/>
+          <w:szCs w:val="24"/>
+          <w:rtl w:val="0"/>
+        </w:rPr>
+        <w:t xml:space="preserve">O fluxo de recuperação de senha foi implementado de forma independente do django-allauth e é dividido em três etapas. Na solicitação, realizada em /</w:t>
+      </w:r>
+      <w:r>
+        <w:rPr>
+          <w:rFonts w:ascii="Arial" w:cs="Arial" w:eastAsia="Arial" w:hAnsi="Arial"/>
+          <w:i w:val="1"/>
+          <w:iCs w:val="1"/>
+          <w:sz w:val="24"/>
+          <w:szCs w:val="24"/>
+          <w:rtl w:val="0"/>
+        </w:rPr>
+        <w:t xml:space="preserve">usuarios</w:t>
+      </w:r>
+      <w:r>
+        <w:rPr>
+          <w:rFonts w:ascii="Arial" w:cs="Arial" w:eastAsia="Arial" w:hAnsi="Arial"/>
+          <w:sz w:val="24"/>
+          <w:szCs w:val="24"/>
+          <w:rtl w:val="0"/>
+        </w:rPr>
+        <w:t xml:space="preserve">/</w:t>
+      </w:r>
+      <w:r>
+        <w:rPr>
+          <w:rFonts w:ascii="Arial" w:cs="Arial" w:eastAsia="Arial" w:hAnsi="Arial"/>
+          <w:i w:val="1"/>
+          <w:iCs w:val="1"/>
+          <w:sz w:val="24"/>
+          <w:szCs w:val="24"/>
+          <w:rtl w:val="0"/>
+        </w:rPr>
+        <w:t xml:space="preserve">recuperar</w:t>
+      </w:r>
+      <w:r>
+        <w:rPr>
+          <w:rFonts w:ascii="Arial" w:cs="Arial" w:eastAsia="Arial" w:hAnsi="Arial"/>
+          <w:sz w:val="24"/>
+          <w:szCs w:val="24"/>
+          <w:rtl w:val="0"/>
+        </w:rPr>
+        <w:t xml:space="preserve">-</w:t>
+      </w:r>
+      <w:r>
+        <w:rPr>
+          <w:rFonts w:ascii="Arial" w:cs="Arial" w:eastAsia="Arial" w:hAnsi="Arial"/>
+          <w:i w:val="1"/>
+          <w:iCs w:val="1"/>
+          <w:sz w:val="24"/>
+          <w:szCs w:val="24"/>
+          <w:rtl w:val="0"/>
+        </w:rPr>
+        <w:t xml:space="preserve">senha</w:t>
+      </w:r>
+      <w:r>
+        <w:rPr>
+          <w:rFonts w:ascii="Arial" w:cs="Arial" w:eastAsia="Arial" w:hAnsi="Arial"/>
+          <w:sz w:val="24"/>
+          <w:szCs w:val="24"/>
+          <w:rtl w:val="0"/>
+        </w:rPr>
+        <w:t xml:space="preserve">/, o usuário informa seu e-mail. Quando o endereço está cadastrado, é gerado um token por meio de </w:t>
+      </w:r>
+      <w:r>
+        <w:rPr>
+          <w:rFonts w:ascii="Arial" w:cs="Arial" w:eastAsia="Arial" w:hAnsi="Arial"/>
+          <w:i w:val="1"/>
+          <w:iCs w:val="1"/>
+          <w:sz w:val="24"/>
+          <w:szCs w:val="24"/>
+          <w:rtl w:val="0"/>
+        </w:rPr>
+        <w:t xml:space="preserve">secrets.token_urlsafe</w:t>
+      </w:r>
+      <w:r>
+        <w:rPr>
+          <w:rFonts w:ascii="Arial" w:cs="Arial" w:eastAsia="Arial" w:hAnsi="Arial"/>
+          <w:sz w:val="24"/>
+          <w:szCs w:val="24"/>
+          <w:rtl w:val="0"/>
+        </w:rPr>
+        <w:t xml:space="preserve">(64), armazenado no banco na forma de hash SHA-256 e com validade de 24 horas. A resposta apresentada ao usuário é a mesma em ambos os casos, independentemente da existência do e-mail, evitando a enumeração de contas.</w:t>
+      </w:r>
+    </w:p>
+    <w:p>
+      <w:pPr>
+        <w:jc w:val="both"/>
+        <w:rPr>
+          <w:rFonts w:ascii="Arial" w:cs="Arial" w:eastAsia="Arial" w:hAnsi="Arial"/>
+          <w:sz w:val="24"/>
+          <w:szCs w:val="24"/>
+        </w:rPr>
+      </w:pPr>
+      <w:r>
+        <w:rPr>
+          <w:rtl w:val="0"/>
+        </w:rPr>
+      </w:r>
+    </w:p>
+    <w:p>
+      <w:pPr>
+        <w:ind w:firstLine="720"/>
+        <w:jc w:val="both"/>
+        <w:rPr>
+          <w:rFonts w:ascii="Arial" w:cs="Arial" w:eastAsia="Arial" w:hAnsi="Arial"/>
+          <w:sz w:val="24"/>
+          <w:szCs w:val="24"/>
+        </w:rPr>
+      </w:pPr>
+      <w:r>
+        <w:rPr>
+          <w:rFonts w:ascii="Arial" w:cs="Arial" w:eastAsia="Arial" w:hAnsi="Arial"/>
+          <w:sz w:val="24"/>
+          <w:szCs w:val="24"/>
+          <w:rtl w:val="0"/>
+        </w:rPr>
+        <w:t xml:space="preserve">Na etapa de validação, realizada em </w:t>
+      </w:r>
+      <w:r>
+        <w:rPr>
+          <w:rFonts w:ascii="Arial" w:cs="Arial" w:eastAsia="Arial" w:hAnsi="Arial"/>
+          <w:i w:val="1"/>
+          <w:iCs w:val="1"/>
+          <w:sz w:val="24"/>
+          <w:szCs w:val="24"/>
+          <w:rtl w:val="0"/>
+        </w:rPr>
+        <w:t xml:space="preserve">/usuarios/recuperar-senha/&lt;token&gt;/</w:t>
+      </w:r>
+      <w:r>
+        <w:rPr>
+          <w:rFonts w:ascii="Arial" w:cs="Arial" w:eastAsia="Arial" w:hAnsi="Arial"/>
+          <w:sz w:val="24"/>
+          <w:szCs w:val="24"/>
+          <w:rtl w:val="0"/>
+        </w:rPr>
+        <w:t xml:space="preserve">, são verificadas a existência, a validade e a utilização prévia do token antes de permitir a definição de uma nova senha. Após a confirmação, o token é marcado como utilizado e não pode ser reutilizado, mesmo que ainda esteja dentro do período de validade.</w:t>
+      </w:r>
+    </w:p>
+    <w:p>
+      <w:pPr>
+        <w:jc w:val="both"/>
+        <w:rPr>
+          <w:rFonts w:ascii="Arial" w:cs="Arial" w:eastAsia="Arial" w:hAnsi="Arial"/>
+          <w:sz w:val="24"/>
+          <w:szCs w:val="24"/>
+        </w:rPr>
+      </w:pPr>
+      <w:r>
+        <w:rPr>
+          <w:rtl w:val="0"/>
+        </w:rPr>
+      </w:r>
+    </w:p>
+    <w:p>
+      <w:pPr>
+        <w:ind w:firstLine="720"/>
+        <w:jc w:val="both"/>
+        <w:rPr>
+          <w:rFonts w:ascii="Arial" w:cs="Arial" w:eastAsia="Arial" w:hAnsi="Arial"/>
+          <w:sz w:val="24"/>
+          <w:szCs w:val="24"/>
+        </w:rPr>
+      </w:pPr>
+      <w:r>
+        <w:rPr>
+          <w:rFonts w:ascii="Arial" w:cs="Arial" w:eastAsia="Arial" w:hAnsi="Arial"/>
+          <w:sz w:val="24"/>
+          <w:szCs w:val="24"/>
+          <w:rtl w:val="0"/>
+        </w:rPr>
+        <w:t xml:space="preserve">Todas as etapas do processo são registradas no log de auditoria por meio de </w:t>
+      </w:r>
+      <w:r>
+        <w:rPr>
+          <w:rFonts w:ascii="Arial" w:cs="Arial" w:eastAsia="Arial" w:hAnsi="Arial"/>
+          <w:i w:val="1"/>
+          <w:iCs w:val="1"/>
+          <w:sz w:val="24"/>
+          <w:szCs w:val="24"/>
+          <w:rtl w:val="0"/>
+        </w:rPr>
+        <w:t xml:space="preserve">registrar_evento_recuperacao_senha</w:t>
+      </w:r>
+      <w:r>
+        <w:rPr>
+          <w:rFonts w:ascii="Arial" w:cs="Arial" w:eastAsia="Arial" w:hAnsi="Arial"/>
+          <w:sz w:val="24"/>
+          <w:szCs w:val="24"/>
+          <w:rtl w:val="0"/>
+        </w:rPr>
+        <w:t xml:space="preserve"> e </w:t>
+      </w:r>
+      <w:r>
+        <w:rPr>
+          <w:rFonts w:ascii="Arial" w:cs="Arial" w:eastAsia="Arial" w:hAnsi="Arial"/>
+          <w:i w:val="1"/>
+          <w:iCs w:val="1"/>
+          <w:sz w:val="24"/>
+          <w:szCs w:val="24"/>
+          <w:rtl w:val="0"/>
+        </w:rPr>
+        <w:t xml:space="preserve">registrar_resultado_recuperacao_senha</w:t>
+      </w:r>
+      <w:r>
+        <w:rPr>
+          <w:rFonts w:ascii="Arial" w:cs="Arial" w:eastAsia="Arial" w:hAnsi="Arial"/>
+          <w:sz w:val="24"/>
+          <w:szCs w:val="24"/>
+          <w:rtl w:val="0"/>
+        </w:rPr>
+        <w:t xml:space="preserve">. Por questões de segurança, os registros não armazenam o token completo nem a senha do usuário.</w:t>
+      </w:r>
+    </w:p>
+    <w:p>
+      <w:pPr>
         <w:pStyle w:val="Heading2"/>
         <w:spacing w:after="100" w:lineRule="auto"/>
         <w:rPr/>
@@ -1165,6 +1685,198 @@
     </w:p>
     <w:p>
       <w:pPr>
+        <w:ind w:firstLine="720"/>
+        <w:jc w:val="both"/>
+        <w:rPr>
+          <w:rFonts w:ascii="Arial" w:cs="Arial" w:eastAsia="Arial" w:hAnsi="Arial"/>
+          <w:sz w:val="24"/>
+          <w:szCs w:val="24"/>
+        </w:rPr>
+      </w:pPr>
+      <w:r>
+        <w:rPr>
+          <w:rFonts w:ascii="Arial" w:cs="Arial" w:eastAsia="Arial" w:hAnsi="Arial"/>
+          <w:sz w:val="24"/>
+          <w:szCs w:val="24"/>
+          <w:rtl w:val="0"/>
+        </w:rPr>
+        <w:t xml:space="preserve">Atualmente, o fluxo de dados contempla apenas informações de Funcionários/Usuários, enquanto os módulos de Aluno e Responsável ainda não foram implementados. No cadastro, são coletados somente os dados necessários para identificação, controle de acesso e comunicação: nome, CPF, telefone, cargo e setor.</w:t>
+      </w:r>
+    </w:p>
+    <w:p>
+      <w:pPr>
+        <w:ind w:firstLine="720"/>
+        <w:jc w:val="both"/>
+        <w:rPr>
+          <w:rFonts w:ascii="Arial" w:cs="Arial" w:eastAsia="Arial" w:hAnsi="Arial"/>
+          <w:sz w:val="24"/>
+          <w:szCs w:val="24"/>
+        </w:rPr>
+      </w:pPr>
+      <w:r>
+        <w:rPr>
+          <w:rtl w:val="0"/>
+        </w:rPr>
+      </w:r>
+    </w:p>
+    <w:p>
+      <w:pPr>
+        <w:ind w:firstLine="720"/>
+        <w:jc w:val="both"/>
+        <w:rPr>
+          <w:rFonts w:ascii="Arial" w:cs="Arial" w:eastAsia="Arial" w:hAnsi="Arial"/>
+          <w:sz w:val="24"/>
+          <w:szCs w:val="24"/>
+        </w:rPr>
+      </w:pPr>
+      <w:r>
+        <w:rPr>
+          <w:rFonts w:ascii="Arial" w:cs="Arial" w:eastAsia="Arial" w:hAnsi="Arial"/>
+          <w:sz w:val="24"/>
+          <w:szCs w:val="24"/>
+          <w:rtl w:val="0"/>
+        </w:rPr>
+        <w:t xml:space="preserve">O consentimento é apresentado ao usuário por meio de um popup no primeiro acesso e controlado por versão (</w:t>
+      </w:r>
+      <w:r>
+        <w:rPr>
+          <w:rFonts w:ascii="Arial" w:cs="Arial" w:eastAsia="Arial" w:hAnsi="Arial"/>
+          <w:i w:val="1"/>
+          <w:iCs w:val="1"/>
+          <w:sz w:val="24"/>
+          <w:szCs w:val="24"/>
+          <w:rtl w:val="0"/>
+        </w:rPr>
+        <w:t xml:space="preserve">CONSENT_VERSION</w:t>
+      </w:r>
+      <w:r>
+        <w:rPr>
+          <w:rFonts w:ascii="Arial" w:cs="Arial" w:eastAsia="Arial" w:hAnsi="Arial"/>
+          <w:sz w:val="24"/>
+          <w:szCs w:val="24"/>
+          <w:rtl w:val="0"/>
+        </w:rPr>
+        <w:t xml:space="preserve">). O registro do aceite é armazenado no localStorage e, quando o usuário está autenticado, também no log de auditoria por meio de uma API específica(</w:t>
+      </w:r>
+      <w:r>
+        <w:rPr>
+          <w:rFonts w:ascii="Arial" w:cs="Arial" w:eastAsia="Arial" w:hAnsi="Arial"/>
+          <w:i w:val="1"/>
+          <w:iCs w:val="1"/>
+          <w:sz w:val="24"/>
+          <w:szCs w:val="24"/>
+          <w:rtl w:val="0"/>
+        </w:rPr>
+        <w:t xml:space="preserve">registrar_consentimento_view</w:t>
+      </w:r>
+      <w:r>
+        <w:rPr>
+          <w:rFonts w:ascii="Arial" w:cs="Arial" w:eastAsia="Arial" w:hAnsi="Arial"/>
+          <w:sz w:val="24"/>
+          <w:szCs w:val="24"/>
+          <w:rtl w:val="0"/>
+        </w:rPr>
+        <w:t xml:space="preserve">).</w:t>
+      </w:r>
+    </w:p>
+    <w:p>
+      <w:pPr>
+        <w:ind w:firstLine="720"/>
+        <w:jc w:val="both"/>
+        <w:rPr>
+          <w:rFonts w:ascii="Arial" w:cs="Arial" w:eastAsia="Arial" w:hAnsi="Arial"/>
+          <w:sz w:val="24"/>
+          <w:szCs w:val="24"/>
+        </w:rPr>
+      </w:pPr>
+      <w:r>
+        <w:rPr>
+          <w:rtl w:val="0"/>
+        </w:rPr>
+      </w:r>
+    </w:p>
+    <w:p>
+      <w:pPr>
+        <w:ind w:firstLine="720"/>
+        <w:jc w:val="both"/>
+        <w:rPr>
+          <w:rFonts w:ascii="Arial" w:cs="Arial" w:eastAsia="Arial" w:hAnsi="Arial"/>
+          <w:sz w:val="24"/>
+          <w:szCs w:val="24"/>
+        </w:rPr>
+      </w:pPr>
+      <w:r>
+        <w:rPr>
+          <w:rFonts w:ascii="Arial" w:cs="Arial" w:eastAsia="Arial" w:hAnsi="Arial"/>
+          <w:sz w:val="24"/>
+          <w:szCs w:val="24"/>
+          <w:rtl w:val="0"/>
+        </w:rPr>
+        <w:t xml:space="preserve">O sistema disponibiliza ao titular recursos para consulta (</w:t>
+      </w:r>
+      <w:r>
+        <w:rPr>
+          <w:rFonts w:ascii="Arial" w:cs="Arial" w:eastAsia="Arial" w:hAnsi="Arial"/>
+          <w:i w:val="1"/>
+          <w:iCs w:val="1"/>
+          <w:sz w:val="24"/>
+          <w:szCs w:val="24"/>
+          <w:rtl w:val="0"/>
+        </w:rPr>
+        <w:t xml:space="preserve">/usuarios/meus-dados/</w:t>
+      </w:r>
+      <w:r>
+        <w:rPr>
+          <w:rFonts w:ascii="Arial" w:cs="Arial" w:eastAsia="Arial" w:hAnsi="Arial"/>
+          <w:sz w:val="24"/>
+          <w:szCs w:val="24"/>
+          <w:rtl w:val="0"/>
+        </w:rPr>
+        <w:t xml:space="preserve">), exportação dos dados em JSON (</w:t>
+      </w:r>
+      <w:r>
+        <w:rPr>
+          <w:rFonts w:ascii="Arial" w:cs="Arial" w:eastAsia="Arial" w:hAnsi="Arial"/>
+          <w:i w:val="1"/>
+          <w:iCs w:val="1"/>
+          <w:sz w:val="24"/>
+          <w:szCs w:val="24"/>
+          <w:rtl w:val="0"/>
+        </w:rPr>
+        <w:t xml:space="preserve">/usuarios/meus-dados/exportar/</w:t>
+      </w:r>
+      <w:r>
+        <w:rPr>
+          <w:rFonts w:ascii="Arial" w:cs="Arial" w:eastAsia="Arial" w:hAnsi="Arial"/>
+          <w:sz w:val="24"/>
+          <w:szCs w:val="24"/>
+          <w:rtl w:val="0"/>
+        </w:rPr>
+        <w:t xml:space="preserve">) e solicitação de exclusão </w:t>
+      </w:r>
+      <w:r>
+        <w:rPr>
+          <w:rFonts w:ascii="Arial" w:cs="Arial" w:eastAsia="Arial" w:hAnsi="Arial"/>
+          <w:i w:val="1"/>
+          <w:iCs w:val="1"/>
+          <w:sz w:val="24"/>
+          <w:szCs w:val="24"/>
+          <w:rtl w:val="0"/>
+        </w:rPr>
+        <w:t xml:space="preserve">(/usuarios/meus-dados/exclusao/</w:t>
+      </w:r>
+      <w:r>
+        <w:rPr>
+          <w:rFonts w:ascii="Arial" w:cs="Arial" w:eastAsia="Arial" w:hAnsi="Arial"/>
+          <w:sz w:val="24"/>
+          <w:szCs w:val="24"/>
+          <w:rtl w:val="0"/>
+        </w:rPr>
+        <w:t xml:space="preserve">). A exclusão é parcial: o telefone é removido automaticamente, enquanto dados como CPF, e-mail e cargo são mantidos quando necessários para identificação e controle de acesso. As exceções são apresentadas ao titular antes da confirmação da solicitação.</w:t>
+      </w:r>
+    </w:p>
+    <w:p>
+      <w:pPr>
         <w:pStyle w:val="Heading1"/>
         <w:spacing w:before="400" w:lineRule="auto"/>
         <w:rPr/>
@@ -1180,10 +1892,13 @@
       <w:pPr>
         <w:pStyle w:val="Heading1"/>
         <w:spacing w:before="400" w:lineRule="auto"/>
-        <w:rPr/>
-      </w:pPr>
-      <w:r>
-        <w:rPr>
+        <w:rPr>
+          <w:highlight w:val="yellow"/>
+        </w:rPr>
+      </w:pPr>
+      <w:r>
+        <w:rPr>
+          <w:highlight w:val="yellow"/>
           <w:rtl w:val="0"/>
         </w:rPr>
         <w:t xml:space="preserve">5. Uso de Criptografia</w:t>
@@ -1912,6 +2627,7 @@
     </w:p>
     <w:p>
       <w:pPr>
+        <w:ind w:firstLine="720"/>
         <w:jc w:val="both"/>
         <w:rPr>
           <w:rFonts w:ascii="Arial" w:cs="Arial" w:eastAsia="Arial" w:hAnsi="Arial"/>
@@ -1966,6 +2682,7 @@
     </w:p>
     <w:p>
       <w:pPr>
+        <w:ind w:firstLine="720"/>
         <w:jc w:val="both"/>
         <w:rPr>
           <w:rFonts w:ascii="Arial" w:cs="Arial" w:eastAsia="Arial" w:hAnsi="Arial"/>
@@ -2025,6 +2742,7 @@
     </w:p>
     <w:p>
       <w:pPr>
+        <w:ind w:firstLine="720"/>
         <w:jc w:val="both"/>
         <w:rPr>
           <w:rFonts w:ascii="Arial" w:cs="Arial" w:eastAsia="Arial" w:hAnsi="Arial"/>
@@ -2061,7 +2779,27 @@
           <w:szCs w:val="24"/>
           <w:rtl w:val="0"/>
         </w:rPr>
-        <w:t xml:space="preserve">. As evidências dos testes manuais estão disponíveis no diretório docs/evidencias.</w:t>
+        <w:t xml:space="preserve">. As evidências dos testes manuais estão disponíveis no diretório </w:t>
+      </w:r>
+      <w:r>
+        <w:rPr>
+          <w:rFonts w:ascii="Arial" w:cs="Arial" w:eastAsia="Arial" w:hAnsi="Arial"/>
+          <w:i w:val="1"/>
+          <w:iCs w:val="1"/>
+          <w:sz w:val="24"/>
+          <w:szCs w:val="24"/>
+          <w:rtl w:val="0"/>
+        </w:rPr>
+        <w:t xml:space="preserve">docs/evidencias</w:t>
+      </w:r>
+      <w:r>
+        <w:rPr>
+          <w:rFonts w:ascii="Arial" w:cs="Arial" w:eastAsia="Arial" w:hAnsi="Arial"/>
+          <w:sz w:val="24"/>
+          <w:szCs w:val="24"/>
+          <w:rtl w:val="0"/>
+        </w:rPr>
+        <w:t xml:space="preserve">.</w:t>
       </w:r>
       <w:r>
         <w:rPr>
@@ -4024,6 +4762,82 @@
           <w:rtl w:val="0"/>
         </w:rPr>
         <w:t xml:space="preserve">11. Referências</w:t>
+      </w:r>
+    </w:p>
+    <w:p>
+      <w:pPr>
+        <w:rPr>
+          <w:rFonts w:ascii="Arial" w:cs="Arial" w:eastAsia="Arial" w:hAnsi="Arial"/>
+          <w:sz w:val="24"/>
+          <w:szCs w:val="24"/>
+        </w:rPr>
+      </w:pPr>
+      <w:r>
+        <w:rPr>
+          <w:rFonts w:ascii="Arial" w:cs="Arial" w:eastAsia="Arial" w:hAnsi="Arial"/>
+          <w:sz w:val="24"/>
+          <w:szCs w:val="24"/>
+          <w:rtl w:val="0"/>
+        </w:rPr>
+        <w:t xml:space="preserve">OWASP FOUNDATION. </w:t>
+      </w:r>
+      <w:r>
+        <w:rPr>
+          <w:rFonts w:ascii="Arial" w:cs="Arial" w:eastAsia="Arial" w:hAnsi="Arial"/>
+          <w:b w:val="1"/>
+          <w:bCs w:val="1"/>
+          <w:sz w:val="24"/>
+          <w:szCs w:val="24"/>
+          <w:rtl w:val="0"/>
+        </w:rPr>
+        <w:t xml:space="preserve">Password Storage Cheat Sheet</w:t>
+      </w:r>
+      <w:r>
+        <w:rPr>
+          <w:rFonts w:ascii="Arial" w:cs="Arial" w:eastAsia="Arial" w:hAnsi="Arial"/>
+          <w:sz w:val="24"/>
+          <w:szCs w:val="24"/>
+          <w:rtl w:val="0"/>
+        </w:rPr>
+        <w:t xml:space="preserve">. OWASP Cheat Sheet Series, 2023. Disponível em:</w:t>
+      </w:r>
+      <w:hyperlink r:id="rId6">
+        <w:r>
+          <w:rPr>
+            <w:rFonts w:ascii="Arial" w:cs="Arial" w:eastAsia="Arial" w:hAnsi="Arial"/>
+            <w:sz w:val="24"/>
+            <w:szCs w:val="24"/>
+            <w:rtl w:val="0"/>
+          </w:rPr>
+          <w:t xml:space="preserve"> </w:t>
+        </w:r>
+      </w:hyperlink>
+      <w:hyperlink r:id="rId7">
+        <w:r>
+          <w:rPr>
+            <w:rFonts w:ascii="Arial" w:cs="Arial" w:eastAsia="Arial" w:hAnsi="Arial"/>
+            <w:color w:val="1155cc"/>
+            <w:sz w:val="24"/>
+            <w:szCs w:val="24"/>
+            <w:u w:val="single"/>
+            <w:rtl w:val="0"/>
+          </w:rPr>
+          <w:t xml:space="preserve">https://cheatsheetseries.owasp.org/cheatsheets/Password_Storage_Cheat_Sheet.html</w:t>
+        </w:r>
+      </w:hyperlink>
+      <w:r>
+        <w:rPr>
+          <w:rFonts w:ascii="Arial" w:cs="Arial" w:eastAsia="Arial" w:hAnsi="Arial"/>
+          <w:sz w:val="24"/>
+          <w:szCs w:val="24"/>
+          <w:rtl w:val="0"/>
+        </w:rPr>
+        <w:t xml:space="preserve">. Acesso em: 29 out. 2026. </w:t>
+      </w:r>
+      <w:r>
+        <w:rPr>
+          <w:rtl w:val="0"/>
+        </w:rPr>
       </w:r>
     </w:p>
     <w:p>
@@ -4255,6 +5069,7 @@
               <w:rPr>
                 <w:rtl w:val="0"/>
               </w:rPr>
+              <w:t xml:space="preserve">27/09/2026</w:t>
             </w:r>
           </w:p>
         </w:tc>
@@ -4274,6 +5089,7 @@
               <w:rPr>
                 <w:rtl w:val="0"/>
               </w:rPr>
+              <w:t xml:space="preserve">Primeira versão da documentação</w:t>
             </w:r>
           </w:p>
         </w:tc>
@@ -4293,6 +5109,7 @@
               <w:rPr>
                 <w:rtl w:val="0"/>
               </w:rPr>
+              <w:t xml:space="preserve">Marcos Antônio Ferreira de Araújo e Matheus de Castro Viana</w:t>
             </w:r>
           </w:p>
         </w:tc>
@@ -4477,8 +5294,8 @@
       </w:r>
     </w:p>
     <w:sectPr>
-      <w:headerReference r:id="rId6" w:type="default"/>
-      <w:footerReference r:id="rId7" w:type="default"/>
+      <w:headerReference r:id="rId8" w:type="default"/>
+      <w:footerReference r:id="rId9" w:type="default"/>
       <w:pgSz w:h="16838" w:w="11906" w:orient="portrait"/>
       <w:pgMar w:bottom="1417" w:top="1417" w:left="1701" w:right="1134" w:header="709" w:footer="709"/>
       <w:pgNumType w:start="1"/>

</xml_diff>